<commit_message>
feat: add demo documents to backend and implement seed script while removing maintenance report
</commit_message>
<xml_diff>
--- a/backend/demo-data/01_histoire_chemin_de_fer.docx
+++ b/backend/demo-data/01_histoire_chemin_de_fer.docx
@@ -12,7 +12,115 @@
     </w:p>
     <w:p>
       <w:r>
-        <w:t>Les premières voies ferrées sont apparues au XIXe siècle, révolutionnant le transport de marchandises et de passagers. L'ère industrielle a propulsé le chemin de fer comme moyen de locomotion principal.</w:t>
+        <w:t>Page 1</w:t>
+        <w:br/>
+        <w:t xml:space="preserve">Texte générique ferroviaire de remplissage pour tester les performances du système RAG sur de grands documents avec beaucoup de bruit. Texte générique ferroviaire de remplissage pour tester les performances du système RAG sur de grands documents avec beaucoup de bruit. Texte générique ferroviaire de remplissage pour tester les performances du système RAG sur de grands documents avec beaucoup de bruit. Texte générique ferroviaire de remplissage pour tester les performances du système RAG sur de grands documents avec beaucoup de bruit. Texte générique ferroviaire de remplissage pour tester les performances du système RAG sur de grands documents avec beaucoup de bruit. Texte générique ferroviaire de remplissage pour tester les performances du système RAG sur de grands documents avec beaucoup de bruit. Texte générique ferroviaire de remplissage pour tester les performances du système RAG sur de grands documents avec beaucoup de bruit. Texte générique ferroviaire de remplissage pour tester les performances du système RAG sur de grands documents avec beaucoup de bruit. Texte générique ferroviaire de remplissage pour tester les performances du système RAG sur de grands documents avec beaucoup de bruit. Texte générique ferroviaire de remplissage pour tester les performances du système RAG sur de grands documents avec beaucoup de bruit. Texte générique ferroviaire de remplissage pour tester les performances du système RAG sur de grands documents avec beaucoup de bruit. Texte générique ferroviaire de remplissage pour tester les performances du système RAG sur de grands documents avec beaucoup de bruit. Texte générique ferroviaire de remplissage pour tester les performances du système RAG sur de grands documents avec beaucoup de bruit. Texte générique ferroviaire de remplissage pour tester les performances du système RAG sur de grands documents avec beaucoup de bruit. Texte générique ferroviaire de remplissage pour tester les performances du système RAG sur de grands documents avec beaucoup de bruit. Texte générique ferroviaire de remplissage pour tester les performances du système RAG sur de grands documents avec beaucoup de bruit. Texte générique ferroviaire de remplissage pour tester les performances du système RAG sur de grands documents avec beaucoup de bruit. Texte générique ferroviaire de remplissage pour tester les performances du système RAG sur de grands documents avec beaucoup de bruit. Texte générique ferroviaire de remplissage pour tester les performances du système RAG sur de grands documents avec beaucoup de bruit. Texte générique ferroviaire de remplissage pour tester les performances du système RAG sur de grands documents avec beaucoup de bruit. Texte générique ferroviaire de remplissage pour tester les performances du système RAG sur de grands documents avec beaucoup de bruit. Texte générique ferroviaire de remplissage pour tester les performances du système RAG sur de grands documents avec beaucoup de bruit. Texte générique ferroviaire de remplissage pour tester les performances du système RAG sur de grands documents avec beaucoup de bruit. Texte générique ferroviaire de remplissage pour tester les performances du système RAG sur de grands documents avec beaucoup de bruit. Texte générique ferroviaire de remplissage pour tester les performances du système RAG sur de grands documents avec beaucoup de bruit. Texte générique ferroviaire de remplissage pour tester les performances du système RAG sur de grands documents avec beaucoup de bruit. Texte générique ferroviaire de remplissage pour tester les performances du système RAG sur de grands documents avec beaucoup de bruit. Texte générique ferroviaire de remplissage pour tester les performances du système RAG sur de grands documents avec beaucoup de bruit. Texte générique ferroviaire de remplissage pour tester les performances du système RAG sur de grands documents avec beaucoup de bruit. Texte générique ferroviaire de remplissage pour tester les performances du système RAG sur de grands documents avec beaucoup de bruit. </w:t>
+      </w:r>
+    </w:p>
+    <w:p>
+      <w:r>
+        <w:br w:type="page"/>
+      </w:r>
+    </w:p>
+    <w:p>
+      <w:r>
+        <w:t>Page 2</w:t>
+        <w:br/>
+        <w:t xml:space="preserve">Texte générique ferroviaire de remplissage pour tester les performances du système RAG sur de grands documents avec beaucoup de bruit. Texte générique ferroviaire de remplissage pour tester les performances du système RAG sur de grands documents avec beaucoup de bruit. Texte générique ferroviaire de remplissage pour tester les performances du système RAG sur de grands documents avec beaucoup de bruit. Texte générique ferroviaire de remplissage pour tester les performances du système RAG sur de grands documents avec beaucoup de bruit. Texte générique ferroviaire de remplissage pour tester les performances du système RAG sur de grands documents avec beaucoup de bruit. Texte générique ferroviaire de remplissage pour tester les performances du système RAG sur de grands documents avec beaucoup de bruit. Texte générique ferroviaire de remplissage pour tester les performances du système RAG sur de grands documents avec beaucoup de bruit. Texte générique ferroviaire de remplissage pour tester les performances du système RAG sur de grands documents avec beaucoup de bruit. Texte générique ferroviaire de remplissage pour tester les performances du système RAG sur de grands documents avec beaucoup de bruit. Texte générique ferroviaire de remplissage pour tester les performances du système RAG sur de grands documents avec beaucoup de bruit. Texte générique ferroviaire de remplissage pour tester les performances du système RAG sur de grands documents avec beaucoup de bruit. Texte générique ferroviaire de remplissage pour tester les performances du système RAG sur de grands documents avec beaucoup de bruit. Texte générique ferroviaire de remplissage pour tester les performances du système RAG sur de grands documents avec beaucoup de bruit. Texte générique ferroviaire de remplissage pour tester les performances du système RAG sur de grands documents avec beaucoup de bruit. Texte générique ferroviaire de remplissage pour tester les performances du système RAG sur de grands documents avec beaucoup de bruit. Texte générique ferroviaire de remplissage pour tester les performances du système RAG sur de grands documents avec beaucoup de bruit. Texte générique ferroviaire de remplissage pour tester les performances du système RAG sur de grands documents avec beaucoup de bruit. Texte générique ferroviaire de remplissage pour tester les performances du système RAG sur de grands documents avec beaucoup de bruit. Texte générique ferroviaire de remplissage pour tester les performances du système RAG sur de grands documents avec beaucoup de bruit. Texte générique ferroviaire de remplissage pour tester les performances du système RAG sur de grands documents avec beaucoup de bruit. Texte générique ferroviaire de remplissage pour tester les performances du système RAG sur de grands documents avec beaucoup de bruit. Texte générique ferroviaire de remplissage pour tester les performances du système RAG sur de grands documents avec beaucoup de bruit. Texte générique ferroviaire de remplissage pour tester les performances du système RAG sur de grands documents avec beaucoup de bruit. Texte générique ferroviaire de remplissage pour tester les performances du système RAG sur de grands documents avec beaucoup de bruit. Texte générique ferroviaire de remplissage pour tester les performances du système RAG sur de grands documents avec beaucoup de bruit. Texte générique ferroviaire de remplissage pour tester les performances du système RAG sur de grands documents avec beaucoup de bruit. Texte générique ferroviaire de remplissage pour tester les performances du système RAG sur de grands documents avec beaucoup de bruit. Texte générique ferroviaire de remplissage pour tester les performances du système RAG sur de grands documents avec beaucoup de bruit. Texte générique ferroviaire de remplissage pour tester les performances du système RAG sur de grands documents avec beaucoup de bruit. Texte générique ferroviaire de remplissage pour tester les performances du système RAG sur de grands documents avec beaucoup de bruit. </w:t>
+      </w:r>
+    </w:p>
+    <w:p>
+      <w:r>
+        <w:br w:type="page"/>
+      </w:r>
+    </w:p>
+    <w:p>
+      <w:r>
+        <w:t>Page 3</w:t>
+        <w:br/>
+        <w:t xml:space="preserve">Texte générique ferroviaire de remplissage pour tester les performances du système RAG sur de grands documents avec beaucoup de bruit. Texte générique ferroviaire de remplissage pour tester les performances du système RAG sur de grands documents avec beaucoup de bruit. Texte générique ferroviaire de remplissage pour tester les performances du système RAG sur de grands documents avec beaucoup de bruit. Texte générique ferroviaire de remplissage pour tester les performances du système RAG sur de grands documents avec beaucoup de bruit. Texte générique ferroviaire de remplissage pour tester les performances du système RAG sur de grands documents avec beaucoup de bruit. Texte générique ferroviaire de remplissage pour tester les performances du système RAG sur de grands documents avec beaucoup de bruit. Texte générique ferroviaire de remplissage pour tester les performances du système RAG sur de grands documents avec beaucoup de bruit. Texte générique ferroviaire de remplissage pour tester les performances du système RAG sur de grands documents avec beaucoup de bruit. Texte générique ferroviaire de remplissage pour tester les performances du système RAG sur de grands documents avec beaucoup de bruit. Texte générique ferroviaire de remplissage pour tester les performances du système RAG sur de grands documents avec beaucoup de bruit. Texte générique ferroviaire de remplissage pour tester les performances du système RAG sur de grands documents avec beaucoup de bruit. Texte générique ferroviaire de remplissage pour tester les performances du système RAG sur de grands documents avec beaucoup de bruit. Texte générique ferroviaire de remplissage pour tester les performances du système RAG sur de grands documents avec beaucoup de bruit. Texte générique ferroviaire de remplissage pour tester les performances du système RAG sur de grands documents avec beaucoup de bruit. Texte générique ferroviaire de remplissage pour tester les performances du système RAG sur de grands documents avec beaucoup de bruit. Texte générique ferroviaire de remplissage pour tester les performances du système RAG sur de grands documents avec beaucoup de bruit. Texte générique ferroviaire de remplissage pour tester les performances du système RAG sur de grands documents avec beaucoup de bruit. Texte générique ferroviaire de remplissage pour tester les performances du système RAG sur de grands documents avec beaucoup de bruit. Texte générique ferroviaire de remplissage pour tester les performances du système RAG sur de grands documents avec beaucoup de bruit. Texte générique ferroviaire de remplissage pour tester les performances du système RAG sur de grands documents avec beaucoup de bruit. Texte générique ferroviaire de remplissage pour tester les performances du système RAG sur de grands documents avec beaucoup de bruit. Texte générique ferroviaire de remplissage pour tester les performances du système RAG sur de grands documents avec beaucoup de bruit. Texte générique ferroviaire de remplissage pour tester les performances du système RAG sur de grands documents avec beaucoup de bruit. Texte générique ferroviaire de remplissage pour tester les performances du système RAG sur de grands documents avec beaucoup de bruit. Texte générique ferroviaire de remplissage pour tester les performances du système RAG sur de grands documents avec beaucoup de bruit. Texte générique ferroviaire de remplissage pour tester les performances du système RAG sur de grands documents avec beaucoup de bruit. Texte générique ferroviaire de remplissage pour tester les performances du système RAG sur de grands documents avec beaucoup de bruit. Texte générique ferroviaire de remplissage pour tester les performances du système RAG sur de grands documents avec beaucoup de bruit. Texte générique ferroviaire de remplissage pour tester les performances du système RAG sur de grands documents avec beaucoup de bruit. Texte générique ferroviaire de remplissage pour tester les performances du système RAG sur de grands documents avec beaucoup de bruit. </w:t>
+      </w:r>
+    </w:p>
+    <w:p>
+      <w:r>
+        <w:br w:type="page"/>
+      </w:r>
+    </w:p>
+    <w:p>
+      <w:r>
+        <w:t>Page 4</w:t>
+        <w:br/>
+        <w:t xml:space="preserve">Texte générique ferroviaire de remplissage pour tester les performances du système RAG sur de grands documents avec beaucoup de bruit. Texte générique ferroviaire de remplissage pour tester les performances du système RAG sur de grands documents avec beaucoup de bruit. Texte générique ferroviaire de remplissage pour tester les performances du système RAG sur de grands documents avec beaucoup de bruit. Texte générique ferroviaire de remplissage pour tester les performances du système RAG sur de grands documents avec beaucoup de bruit. Texte générique ferroviaire de remplissage pour tester les performances du système RAG sur de grands documents avec beaucoup de bruit. Texte générique ferroviaire de remplissage pour tester les performances du système RAG sur de grands documents avec beaucoup de bruit. Texte générique ferroviaire de remplissage pour tester les performances du système RAG sur de grands documents avec beaucoup de bruit. Texte générique ferroviaire de remplissage pour tester les performances du système RAG sur de grands documents avec beaucoup de bruit. Texte générique ferroviaire de remplissage pour tester les performances du système RAG sur de grands documents avec beaucoup de bruit. Texte générique ferroviaire de remplissage pour tester les performances du système RAG sur de grands documents avec beaucoup de bruit. Texte générique ferroviaire de remplissage pour tester les performances du système RAG sur de grands documents avec beaucoup de bruit. Texte générique ferroviaire de remplissage pour tester les performances du système RAG sur de grands documents avec beaucoup de bruit. Texte générique ferroviaire de remplissage pour tester les performances du système RAG sur de grands documents avec beaucoup de bruit. Texte générique ferroviaire de remplissage pour tester les performances du système RAG sur de grands documents avec beaucoup de bruit. Texte générique ferroviaire de remplissage pour tester les performances du système RAG sur de grands documents avec beaucoup de bruit. Texte générique ferroviaire de remplissage pour tester les performances du système RAG sur de grands documents avec beaucoup de bruit. Texte générique ferroviaire de remplissage pour tester les performances du système RAG sur de grands documents avec beaucoup de bruit. Texte générique ferroviaire de remplissage pour tester les performances du système RAG sur de grands documents avec beaucoup de bruit. Texte générique ferroviaire de remplissage pour tester les performances du système RAG sur de grands documents avec beaucoup de bruit. Texte générique ferroviaire de remplissage pour tester les performances du système RAG sur de grands documents avec beaucoup de bruit. Texte générique ferroviaire de remplissage pour tester les performances du système RAG sur de grands documents avec beaucoup de bruit. Texte générique ferroviaire de remplissage pour tester les performances du système RAG sur de grands documents avec beaucoup de bruit. Texte générique ferroviaire de remplissage pour tester les performances du système RAG sur de grands documents avec beaucoup de bruit. Texte générique ferroviaire de remplissage pour tester les performances du système RAG sur de grands documents avec beaucoup de bruit. Texte générique ferroviaire de remplissage pour tester les performances du système RAG sur de grands documents avec beaucoup de bruit. Texte générique ferroviaire de remplissage pour tester les performances du système RAG sur de grands documents avec beaucoup de bruit. Texte générique ferroviaire de remplissage pour tester les performances du système RAG sur de grands documents avec beaucoup de bruit. Texte générique ferroviaire de remplissage pour tester les performances du système RAG sur de grands documents avec beaucoup de bruit. Texte générique ferroviaire de remplissage pour tester les performances du système RAG sur de grands documents avec beaucoup de bruit. Texte générique ferroviaire de remplissage pour tester les performances du système RAG sur de grands documents avec beaucoup de bruit. </w:t>
+      </w:r>
+    </w:p>
+    <w:p>
+      <w:r>
+        <w:br w:type="page"/>
+      </w:r>
+    </w:p>
+    <w:p>
+      <w:r>
+        <w:t>Page 5</w:t>
+        <w:br/>
+        <w:t xml:space="preserve">Texte générique ferroviaire de remplissage pour tester les performances du système RAG sur de grands documents avec beaucoup de bruit. Texte générique ferroviaire de remplissage pour tester les performances du système RAG sur de grands documents avec beaucoup de bruit. Texte générique ferroviaire de remplissage pour tester les performances du système RAG sur de grands documents avec beaucoup de bruit. Texte générique ferroviaire de remplissage pour tester les performances du système RAG sur de grands documents avec beaucoup de bruit. Texte générique ferroviaire de remplissage pour tester les performances du système RAG sur de grands documents avec beaucoup de bruit. Texte générique ferroviaire de remplissage pour tester les performances du système RAG sur de grands documents avec beaucoup de bruit. Texte générique ferroviaire de remplissage pour tester les performances du système RAG sur de grands documents avec beaucoup de bruit. Texte générique ferroviaire de remplissage pour tester les performances du système RAG sur de grands documents avec beaucoup de bruit. Texte générique ferroviaire de remplissage pour tester les performances du système RAG sur de grands documents avec beaucoup de bruit. Texte générique ferroviaire de remplissage pour tester les performances du système RAG sur de grands documents avec beaucoup de bruit. Texte générique ferroviaire de remplissage pour tester les performances du système RAG sur de grands documents avec beaucoup de bruit. Texte générique ferroviaire de remplissage pour tester les performances du système RAG sur de grands documents avec beaucoup de bruit. Texte générique ferroviaire de remplissage pour tester les performances du système RAG sur de grands documents avec beaucoup de bruit. Texte générique ferroviaire de remplissage pour tester les performances du système RAG sur de grands documents avec beaucoup de bruit. Texte générique ferroviaire de remplissage pour tester les performances du système RAG sur de grands documents avec beaucoup de bruit. Texte générique ferroviaire de remplissage pour tester les performances du système RAG sur de grands documents avec beaucoup de bruit. Texte générique ferroviaire de remplissage pour tester les performances du système RAG sur de grands documents avec beaucoup de bruit. Texte générique ferroviaire de remplissage pour tester les performances du système RAG sur de grands documents avec beaucoup de bruit. Texte générique ferroviaire de remplissage pour tester les performances du système RAG sur de grands documents avec beaucoup de bruit. Texte générique ferroviaire de remplissage pour tester les performances du système RAG sur de grands documents avec beaucoup de bruit. Texte générique ferroviaire de remplissage pour tester les performances du système RAG sur de grands documents avec beaucoup de bruit. Texte générique ferroviaire de remplissage pour tester les performances du système RAG sur de grands documents avec beaucoup de bruit. Texte générique ferroviaire de remplissage pour tester les performances du système RAG sur de grands documents avec beaucoup de bruit. Texte générique ferroviaire de remplissage pour tester les performances du système RAG sur de grands documents avec beaucoup de bruit. Texte générique ferroviaire de remplissage pour tester les performances du système RAG sur de grands documents avec beaucoup de bruit. Texte générique ferroviaire de remplissage pour tester les performances du système RAG sur de grands documents avec beaucoup de bruit. Texte générique ferroviaire de remplissage pour tester les performances du système RAG sur de grands documents avec beaucoup de bruit. Texte générique ferroviaire de remplissage pour tester les performances du système RAG sur de grands documents avec beaucoup de bruit. Texte générique ferroviaire de remplissage pour tester les performances du système RAG sur de grands documents avec beaucoup de bruit. Texte générique ferroviaire de remplissage pour tester les performances du système RAG sur de grands documents avec beaucoup de bruit. </w:t>
+      </w:r>
+    </w:p>
+    <w:p>
+      <w:r>
+        <w:br w:type="page"/>
+      </w:r>
+    </w:p>
+    <w:p>
+      <w:r>
+        <w:t>Page 6</w:t>
+        <w:br/>
+        <w:t xml:space="preserve">Texte générique ferroviaire de remplissage pour tester les performances du système RAG sur de grands documents avec beaucoup de bruit. Texte générique ferroviaire de remplissage pour tester les performances du système RAG sur de grands documents avec beaucoup de bruit. Texte générique ferroviaire de remplissage pour tester les performances du système RAG sur de grands documents avec beaucoup de bruit. Texte générique ferroviaire de remplissage pour tester les performances du système RAG sur de grands documents avec beaucoup de bruit. Texte générique ferroviaire de remplissage pour tester les performances du système RAG sur de grands documents avec beaucoup de bruit. Texte générique ferroviaire de remplissage pour tester les performances du système RAG sur de grands documents avec beaucoup de bruit. Texte générique ferroviaire de remplissage pour tester les performances du système RAG sur de grands documents avec beaucoup de bruit. Texte générique ferroviaire de remplissage pour tester les performances du système RAG sur de grands documents avec beaucoup de bruit. Texte générique ferroviaire de remplissage pour tester les performances du système RAG sur de grands documents avec beaucoup de bruit. Texte générique ferroviaire de remplissage pour tester les performances du système RAG sur de grands documents avec beaucoup de bruit. Texte générique ferroviaire de remplissage pour tester les performances du système RAG sur de grands documents avec beaucoup de bruit. Texte générique ferroviaire de remplissage pour tester les performances du système RAG sur de grands documents avec beaucoup de bruit. Texte générique ferroviaire de remplissage pour tester les performances du système RAG sur de grands documents avec beaucoup de bruit. Texte générique ferroviaire de remplissage pour tester les performances du système RAG sur de grands documents avec beaucoup de bruit. Texte générique ferroviaire de remplissage pour tester les performances du système RAG sur de grands documents avec beaucoup de bruit. Texte générique ferroviaire de remplissage pour tester les performances du système RAG sur de grands documents avec beaucoup de bruit. Texte générique ferroviaire de remplissage pour tester les performances du système RAG sur de grands documents avec beaucoup de bruit. Texte générique ferroviaire de remplissage pour tester les performances du système RAG sur de grands documents avec beaucoup de bruit. Texte générique ferroviaire de remplissage pour tester les performances du système RAG sur de grands documents avec beaucoup de bruit. Texte générique ferroviaire de remplissage pour tester les performances du système RAG sur de grands documents avec beaucoup de bruit. Texte générique ferroviaire de remplissage pour tester les performances du système RAG sur de grands documents avec beaucoup de bruit. Texte générique ferroviaire de remplissage pour tester les performances du système RAG sur de grands documents avec beaucoup de bruit. Texte générique ferroviaire de remplissage pour tester les performances du système RAG sur de grands documents avec beaucoup de bruit. Texte générique ferroviaire de remplissage pour tester les performances du système RAG sur de grands documents avec beaucoup de bruit. Texte générique ferroviaire de remplissage pour tester les performances du système RAG sur de grands documents avec beaucoup de bruit. Texte générique ferroviaire de remplissage pour tester les performances du système RAG sur de grands documents avec beaucoup de bruit. Texte générique ferroviaire de remplissage pour tester les performances du système RAG sur de grands documents avec beaucoup de bruit. Texte générique ferroviaire de remplissage pour tester les performances du système RAG sur de grands documents avec beaucoup de bruit. Texte générique ferroviaire de remplissage pour tester les performances du système RAG sur de grands documents avec beaucoup de bruit. Texte générique ferroviaire de remplissage pour tester les performances du système RAG sur de grands documents avec beaucoup de bruit. </w:t>
+      </w:r>
+    </w:p>
+    <w:p>
+      <w:r>
+        <w:br w:type="page"/>
+      </w:r>
+    </w:p>
+    <w:p>
+      <w:r>
+        <w:t>Page 7</w:t>
+        <w:br/>
+        <w:t xml:space="preserve">Texte générique ferroviaire de remplissage pour tester les performances du système RAG sur de grands documents avec beaucoup de bruit. Texte générique ferroviaire de remplissage pour tester les performances du système RAG sur de grands documents avec beaucoup de bruit. Texte générique ferroviaire de remplissage pour tester les performances du système RAG sur de grands documents avec beaucoup de bruit. Texte générique ferroviaire de remplissage pour tester les performances du système RAG sur de grands documents avec beaucoup de bruit. Texte générique ferroviaire de remplissage pour tester les performances du système RAG sur de grands documents avec beaucoup de bruit. Texte générique ferroviaire de remplissage pour tester les performances du système RAG sur de grands documents avec beaucoup de bruit. Texte générique ferroviaire de remplissage pour tester les performances du système RAG sur de grands documents avec beaucoup de bruit. Texte générique ferroviaire de remplissage pour tester les performances du système RAG sur de grands documents avec beaucoup de bruit. Texte générique ferroviaire de remplissage pour tester les performances du système RAG sur de grands documents avec beaucoup de bruit. Texte générique ferroviaire de remplissage pour tester les performances du système RAG sur de grands documents avec beaucoup de bruit. Texte générique ferroviaire de remplissage pour tester les performances du système RAG sur de grands documents avec beaucoup de bruit. Texte générique ferroviaire de remplissage pour tester les performances du système RAG sur de grands documents avec beaucoup de bruit. Texte générique ferroviaire de remplissage pour tester les performances du système RAG sur de grands documents avec beaucoup de bruit. Texte générique ferroviaire de remplissage pour tester les performances du système RAG sur de grands documents avec beaucoup de bruit. Texte générique ferroviaire de remplissage pour tester les performances du système RAG sur de grands documents avec beaucoup de bruit. Texte générique ferroviaire de remplissage pour tester les performances du système RAG sur de grands documents avec beaucoup de bruit. Texte générique ferroviaire de remplissage pour tester les performances du système RAG sur de grands documents avec beaucoup de bruit. Texte générique ferroviaire de remplissage pour tester les performances du système RAG sur de grands documents avec beaucoup de bruit. Texte générique ferroviaire de remplissage pour tester les performances du système RAG sur de grands documents avec beaucoup de bruit. Texte générique ferroviaire de remplissage pour tester les performances du système RAG sur de grands documents avec beaucoup de bruit. Texte générique ferroviaire de remplissage pour tester les performances du système RAG sur de grands documents avec beaucoup de bruit. Texte générique ferroviaire de remplissage pour tester les performances du système RAG sur de grands documents avec beaucoup de bruit. Texte générique ferroviaire de remplissage pour tester les performances du système RAG sur de grands documents avec beaucoup de bruit. Texte générique ferroviaire de remplissage pour tester les performances du système RAG sur de grands documents avec beaucoup de bruit. Texte générique ferroviaire de remplissage pour tester les performances du système RAG sur de grands documents avec beaucoup de bruit. Texte générique ferroviaire de remplissage pour tester les performances du système RAG sur de grands documents avec beaucoup de bruit. Texte générique ferroviaire de remplissage pour tester les performances du système RAG sur de grands documents avec beaucoup de bruit. Texte générique ferroviaire de remplissage pour tester les performances du système RAG sur de grands documents avec beaucoup de bruit. Texte générique ferroviaire de remplissage pour tester les performances du système RAG sur de grands documents avec beaucoup de bruit. Texte générique ferroviaire de remplissage pour tester les performances du système RAG sur de grands documents avec beaucoup de bruit. </w:t>
+      </w:r>
+    </w:p>
+    <w:p>
+      <w:r>
+        <w:br w:type="page"/>
+      </w:r>
+    </w:p>
+    <w:p>
+      <w:r>
+        <w:t>Les premières voies ferrées sont apparues au XIXe siècle, révolutionnant le transport de marchandises et de passagers.</w:t>
+      </w:r>
+    </w:p>
+    <w:p>
+      <w:r>
+        <w:br w:type="page"/>
+      </w:r>
+    </w:p>
+    <w:p>
+      <w:r>
+        <w:t>Page 9</w:t>
+        <w:br/>
+        <w:t xml:space="preserve">Texte générique ferroviaire de remplissage pour tester les performances du système RAG sur de grands documents avec beaucoup de bruit. Texte générique ferroviaire de remplissage pour tester les performances du système RAG sur de grands documents avec beaucoup de bruit. Texte générique ferroviaire de remplissage pour tester les performances du système RAG sur de grands documents avec beaucoup de bruit. Texte générique ferroviaire de remplissage pour tester les performances du système RAG sur de grands documents avec beaucoup de bruit. Texte générique ferroviaire de remplissage pour tester les performances du système RAG sur de grands documents avec beaucoup de bruit. Texte générique ferroviaire de remplissage pour tester les performances du système RAG sur de grands documents avec beaucoup de bruit. Texte générique ferroviaire de remplissage pour tester les performances du système RAG sur de grands documents avec beaucoup de bruit. Texte générique ferroviaire de remplissage pour tester les performances du système RAG sur de grands documents avec beaucoup de bruit. Texte générique ferroviaire de remplissage pour tester les performances du système RAG sur de grands documents avec beaucoup de bruit. Texte générique ferroviaire de remplissage pour tester les performances du système RAG sur de grands documents avec beaucoup de bruit. Texte générique ferroviaire de remplissage pour tester les performances du système RAG sur de grands documents avec beaucoup de bruit. Texte générique ferroviaire de remplissage pour tester les performances du système RAG sur de grands documents avec beaucoup de bruit. Texte générique ferroviaire de remplissage pour tester les performances du système RAG sur de grands documents avec beaucoup de bruit. Texte générique ferroviaire de remplissage pour tester les performances du système RAG sur de grands documents avec beaucoup de bruit. Texte générique ferroviaire de remplissage pour tester les performances du système RAG sur de grands documents avec beaucoup de bruit. Texte générique ferroviaire de remplissage pour tester les performances du système RAG sur de grands documents avec beaucoup de bruit. Texte générique ferroviaire de remplissage pour tester les performances du système RAG sur de grands documents avec beaucoup de bruit. Texte générique ferroviaire de remplissage pour tester les performances du système RAG sur de grands documents avec beaucoup de bruit. Texte générique ferroviaire de remplissage pour tester les performances du système RAG sur de grands documents avec beaucoup de bruit. Texte générique ferroviaire de remplissage pour tester les performances du système RAG sur de grands documents avec beaucoup de bruit. Texte générique ferroviaire de remplissage pour tester les performances du système RAG sur de grands documents avec beaucoup de bruit. Texte générique ferroviaire de remplissage pour tester les performances du système RAG sur de grands documents avec beaucoup de bruit. Texte générique ferroviaire de remplissage pour tester les performances du système RAG sur de grands documents avec beaucoup de bruit. Texte générique ferroviaire de remplissage pour tester les performances du système RAG sur de grands documents avec beaucoup de bruit. Texte générique ferroviaire de remplissage pour tester les performances du système RAG sur de grands documents avec beaucoup de bruit. Texte générique ferroviaire de remplissage pour tester les performances du système RAG sur de grands documents avec beaucoup de bruit. Texte générique ferroviaire de remplissage pour tester les performances du système RAG sur de grands documents avec beaucoup de bruit. Texte générique ferroviaire de remplissage pour tester les performances du système RAG sur de grands documents avec beaucoup de bruit. Texte générique ferroviaire de remplissage pour tester les performances du système RAG sur de grands documents avec beaucoup de bruit. Texte générique ferroviaire de remplissage pour tester les performances du système RAG sur de grands documents avec beaucoup de bruit. </w:t>
+      </w:r>
+    </w:p>
+    <w:p>
+      <w:r>
+        <w:br w:type="page"/>
+      </w:r>
+    </w:p>
+    <w:p>
+      <w:r>
+        <w:t>Page 10</w:t>
+        <w:br/>
+        <w:t xml:space="preserve">Texte générique ferroviaire de remplissage pour tester les performances du système RAG sur de grands documents avec beaucoup de bruit. Texte générique ferroviaire de remplissage pour tester les performances du système RAG sur de grands documents avec beaucoup de bruit. Texte générique ferroviaire de remplissage pour tester les performances du système RAG sur de grands documents avec beaucoup de bruit. Texte générique ferroviaire de remplissage pour tester les performances du système RAG sur de grands documents avec beaucoup de bruit. Texte générique ferroviaire de remplissage pour tester les performances du système RAG sur de grands documents avec beaucoup de bruit. Texte générique ferroviaire de remplissage pour tester les performances du système RAG sur de grands documents avec beaucoup de bruit. Texte générique ferroviaire de remplissage pour tester les performances du système RAG sur de grands documents avec beaucoup de bruit. Texte générique ferroviaire de remplissage pour tester les performances du système RAG sur de grands documents avec beaucoup de bruit. Texte générique ferroviaire de remplissage pour tester les performances du système RAG sur de grands documents avec beaucoup de bruit. Texte générique ferroviaire de remplissage pour tester les performances du système RAG sur de grands documents avec beaucoup de bruit. Texte générique ferroviaire de remplissage pour tester les performances du système RAG sur de grands documents avec beaucoup de bruit. Texte générique ferroviaire de remplissage pour tester les performances du système RAG sur de grands documents avec beaucoup de bruit. Texte générique ferroviaire de remplissage pour tester les performances du système RAG sur de grands documents avec beaucoup de bruit. Texte générique ferroviaire de remplissage pour tester les performances du système RAG sur de grands documents avec beaucoup de bruit. Texte générique ferroviaire de remplissage pour tester les performances du système RAG sur de grands documents avec beaucoup de bruit. Texte générique ferroviaire de remplissage pour tester les performances du système RAG sur de grands documents avec beaucoup de bruit. Texte générique ferroviaire de remplissage pour tester les performances du système RAG sur de grands documents avec beaucoup de bruit. Texte générique ferroviaire de remplissage pour tester les performances du système RAG sur de grands documents avec beaucoup de bruit. Texte générique ferroviaire de remplissage pour tester les performances du système RAG sur de grands documents avec beaucoup de bruit. Texte générique ferroviaire de remplissage pour tester les performances du système RAG sur de grands documents avec beaucoup de bruit. Texte générique ferroviaire de remplissage pour tester les performances du système RAG sur de grands documents avec beaucoup de bruit. Texte générique ferroviaire de remplissage pour tester les performances du système RAG sur de grands documents avec beaucoup de bruit. Texte générique ferroviaire de remplissage pour tester les performances du système RAG sur de grands documents avec beaucoup de bruit. Texte générique ferroviaire de remplissage pour tester les performances du système RAG sur de grands documents avec beaucoup de bruit. Texte générique ferroviaire de remplissage pour tester les performances du système RAG sur de grands documents avec beaucoup de bruit. Texte générique ferroviaire de remplissage pour tester les performances du système RAG sur de grands documents avec beaucoup de bruit. Texte générique ferroviaire de remplissage pour tester les performances du système RAG sur de grands documents avec beaucoup de bruit. Texte générique ferroviaire de remplissage pour tester les performances du système RAG sur de grands documents avec beaucoup de bruit. Texte générique ferroviaire de remplissage pour tester les performances du système RAG sur de grands documents avec beaucoup de bruit. Texte générique ferroviaire de remplissage pour tester les performances du système RAG sur de grands documents avec beaucoup de bruit. </w:t>
       </w:r>
     </w:p>
     <w:sectPr>

</xml_diff>

<commit_message>
feat: initialize RailMind Lite backend with manual build scripts and seed data
</commit_message>
<xml_diff>
--- a/backend/demo-data/01_histoire_chemin_de_fer.docx
+++ b/backend/demo-data/01_histoire_chemin_de_fer.docx
@@ -4,123 +4,72 @@
   <w:body>
     <w:p>
       <w:pPr>
-        <w:pStyle w:val="Title"/>
+        <w:spacing w:before="240" w:after="120"/>
       </w:pPr>
       <w:r>
-        <w:t>01_histoire_chemin_de_fer</w:t>
+        <w:rPr>
+          <w:b/>
+          <w:color w:val="C00000"/>
+          <w:sz w:val="36"/>
+        </w:rPr>
+        <w:t>CAMRAIL — Histoire du Reseau Ferroviaire Camerounais</w:t>
       </w:r>
     </w:p>
     <w:p>
       <w:r>
-        <w:t>Page 1</w:t>
+        <w:rPr>
+          <w:sz w:val="18"/>
+        </w:rPr>
+        <w:t>Direction Générale | Document de référence | Réf : HIST-CAM-2026</w:t>
         <w:br/>
-        <w:t xml:space="preserve">Texte générique ferroviaire de remplissage pour tester les performances du système RAG sur de grands documents avec beaucoup de bruit. Texte générique ferroviaire de remplissage pour tester les performances du système RAG sur de grands documents avec beaucoup de bruit. Texte générique ferroviaire de remplissage pour tester les performances du système RAG sur de grands documents avec beaucoup de bruit. Texte générique ferroviaire de remplissage pour tester les performances du système RAG sur de grands documents avec beaucoup de bruit. Texte générique ferroviaire de remplissage pour tester les performances du système RAG sur de grands documents avec beaucoup de bruit. Texte générique ferroviaire de remplissage pour tester les performances du système RAG sur de grands documents avec beaucoup de bruit. Texte générique ferroviaire de remplissage pour tester les performances du système RAG sur de grands documents avec beaucoup de bruit. Texte générique ferroviaire de remplissage pour tester les performances du système RAG sur de grands documents avec beaucoup de bruit. Texte générique ferroviaire de remplissage pour tester les performances du système RAG sur de grands documents avec beaucoup de bruit. Texte générique ferroviaire de remplissage pour tester les performances du système RAG sur de grands documents avec beaucoup de bruit. Texte générique ferroviaire de remplissage pour tester les performances du système RAG sur de grands documents avec beaucoup de bruit. Texte générique ferroviaire de remplissage pour tester les performances du système RAG sur de grands documents avec beaucoup de bruit. Texte générique ferroviaire de remplissage pour tester les performances du système RAG sur de grands documents avec beaucoup de bruit. Texte générique ferroviaire de remplissage pour tester les performances du système RAG sur de grands documents avec beaucoup de bruit. Texte générique ferroviaire de remplissage pour tester les performances du système RAG sur de grands documents avec beaucoup de bruit. Texte générique ferroviaire de remplissage pour tester les performances du système RAG sur de grands documents avec beaucoup de bruit. Texte générique ferroviaire de remplissage pour tester les performances du système RAG sur de grands documents avec beaucoup de bruit. Texte générique ferroviaire de remplissage pour tester les performances du système RAG sur de grands documents avec beaucoup de bruit. Texte générique ferroviaire de remplissage pour tester les performances du système RAG sur de grands documents avec beaucoup de bruit. Texte générique ferroviaire de remplissage pour tester les performances du système RAG sur de grands documents avec beaucoup de bruit. Texte générique ferroviaire de remplissage pour tester les performances du système RAG sur de grands documents avec beaucoup de bruit. Texte générique ferroviaire de remplissage pour tester les performances du système RAG sur de grands documents avec beaucoup de bruit. Texte générique ferroviaire de remplissage pour tester les performances du système RAG sur de grands documents avec beaucoup de bruit. Texte générique ferroviaire de remplissage pour tester les performances du système RAG sur de grands documents avec beaucoup de bruit. Texte générique ferroviaire de remplissage pour tester les performances du système RAG sur de grands documents avec beaucoup de bruit. Texte générique ferroviaire de remplissage pour tester les performances du système RAG sur de grands documents avec beaucoup de bruit. Texte générique ferroviaire de remplissage pour tester les performances du système RAG sur de grands documents avec beaucoup de bruit. Texte générique ferroviaire de remplissage pour tester les performances du système RAG sur de grands documents avec beaucoup de bruit. Texte générique ferroviaire de remplissage pour tester les performances du système RAG sur de grands documents avec beaucoup de bruit. Texte générique ferroviaire de remplissage pour tester les performances du système RAG sur de grands documents avec beaucoup de bruit. </w:t>
       </w:r>
     </w:p>
     <w:p>
+      <w:pPr>
+        <w:spacing w:before="240" w:after="120"/>
+      </w:pPr>
       <w:r>
-        <w:br w:type="page"/>
+        <w:rPr>
+          <w:b/>
+          <w:color w:val="C00000"/>
+          <w:sz w:val="28"/>
+        </w:rPr>
+        <w:t>1. Origines et construction du Transcamerounais</w:t>
       </w:r>
     </w:p>
     <w:p>
+      <w:pPr>
+        <w:spacing w:after="120"/>
+      </w:pPr>
       <w:r>
-        <w:t>Page 2</w:t>
-        <w:br/>
-        <w:t xml:space="preserve">Texte générique ferroviaire de remplissage pour tester les performances du système RAG sur de grands documents avec beaucoup de bruit. Texte générique ferroviaire de remplissage pour tester les performances du système RAG sur de grands documents avec beaucoup de bruit. Texte générique ferroviaire de remplissage pour tester les performances du système RAG sur de grands documents avec beaucoup de bruit. Texte générique ferroviaire de remplissage pour tester les performances du système RAG sur de grands documents avec beaucoup de bruit. Texte générique ferroviaire de remplissage pour tester les performances du système RAG sur de grands documents avec beaucoup de bruit. Texte générique ferroviaire de remplissage pour tester les performances du système RAG sur de grands documents avec beaucoup de bruit. Texte générique ferroviaire de remplissage pour tester les performances du système RAG sur de grands documents avec beaucoup de bruit. Texte générique ferroviaire de remplissage pour tester les performances du système RAG sur de grands documents avec beaucoup de bruit. Texte générique ferroviaire de remplissage pour tester les performances du système RAG sur de grands documents avec beaucoup de bruit. Texte générique ferroviaire de remplissage pour tester les performances du système RAG sur de grands documents avec beaucoup de bruit. Texte générique ferroviaire de remplissage pour tester les performances du système RAG sur de grands documents avec beaucoup de bruit. Texte générique ferroviaire de remplissage pour tester les performances du système RAG sur de grands documents avec beaucoup de bruit. Texte générique ferroviaire de remplissage pour tester les performances du système RAG sur de grands documents avec beaucoup de bruit. Texte générique ferroviaire de remplissage pour tester les performances du système RAG sur de grands documents avec beaucoup de bruit. Texte générique ferroviaire de remplissage pour tester les performances du système RAG sur de grands documents avec beaucoup de bruit. Texte générique ferroviaire de remplissage pour tester les performances du système RAG sur de grands documents avec beaucoup de bruit. Texte générique ferroviaire de remplissage pour tester les performances du système RAG sur de grands documents avec beaucoup de bruit. Texte générique ferroviaire de remplissage pour tester les performances du système RAG sur de grands documents avec beaucoup de bruit. Texte générique ferroviaire de remplissage pour tester les performances du système RAG sur de grands documents avec beaucoup de bruit. Texte générique ferroviaire de remplissage pour tester les performances du système RAG sur de grands documents avec beaucoup de bruit. Texte générique ferroviaire de remplissage pour tester les performances du système RAG sur de grands documents avec beaucoup de bruit. Texte générique ferroviaire de remplissage pour tester les performances du système RAG sur de grands documents avec beaucoup de bruit. Texte générique ferroviaire de remplissage pour tester les performances du système RAG sur de grands documents avec beaucoup de bruit. Texte générique ferroviaire de remplissage pour tester les performances du système RAG sur de grands documents avec beaucoup de bruit. Texte générique ferroviaire de remplissage pour tester les performances du système RAG sur de grands documents avec beaucoup de bruit. Texte générique ferroviaire de remplissage pour tester les performances du système RAG sur de grands documents avec beaucoup de bruit. Texte générique ferroviaire de remplissage pour tester les performances du système RAG sur de grands documents avec beaucoup de bruit. Texte générique ferroviaire de remplissage pour tester les performances du système RAG sur de grands documents avec beaucoup de bruit. Texte générique ferroviaire de remplissage pour tester les performances du système RAG sur de grands documents avec beaucoup de bruit. Texte générique ferroviaire de remplissage pour tester les performances du système RAG sur de grands documents avec beaucoup de bruit. </w:t>
+        <w:rPr>
+          <w:sz w:val="22"/>
+        </w:rPr>
+        <w:t>Le réseau ferroviaire du Cameroun a été initié au début du XXe siècle. Après l indépendance en 1960, la Régie Nationale des Chemins de Fer du Cameroun (Régifercam) a conduit la construction du Transcamerounais reliant Douala à Yaoundé puis Ngaoundéré, désenclavant le Nord du pays.</w:t>
       </w:r>
     </w:p>
     <w:p>
+      <w:pPr>
+        <w:spacing w:before="240" w:after="120"/>
+      </w:pPr>
       <w:r>
-        <w:br w:type="page"/>
+        <w:rPr>
+          <w:b/>
+          <w:color w:val="C00000"/>
+          <w:sz w:val="28"/>
+        </w:rPr>
+        <w:t>2. Concession CAMRAIL</w:t>
       </w:r>
     </w:p>
     <w:p>
+      <w:pPr>
+        <w:spacing w:after="120"/>
+      </w:pPr>
       <w:r>
-        <w:t>Page 3</w:t>
-        <w:br/>
-        <w:t xml:space="preserve">Texte générique ferroviaire de remplissage pour tester les performances du système RAG sur de grands documents avec beaucoup de bruit. Texte générique ferroviaire de remplissage pour tester les performances du système RAG sur de grands documents avec beaucoup de bruit. Texte générique ferroviaire de remplissage pour tester les performances du système RAG sur de grands documents avec beaucoup de bruit. Texte générique ferroviaire de remplissage pour tester les performances du système RAG sur de grands documents avec beaucoup de bruit. Texte générique ferroviaire de remplissage pour tester les performances du système RAG sur de grands documents avec beaucoup de bruit. Texte générique ferroviaire de remplissage pour tester les performances du système RAG sur de grands documents avec beaucoup de bruit. Texte générique ferroviaire de remplissage pour tester les performances du système RAG sur de grands documents avec beaucoup de bruit. Texte générique ferroviaire de remplissage pour tester les performances du système RAG sur de grands documents avec beaucoup de bruit. Texte générique ferroviaire de remplissage pour tester les performances du système RAG sur de grands documents avec beaucoup de bruit. Texte générique ferroviaire de remplissage pour tester les performances du système RAG sur de grands documents avec beaucoup de bruit. Texte générique ferroviaire de remplissage pour tester les performances du système RAG sur de grands documents avec beaucoup de bruit. Texte générique ferroviaire de remplissage pour tester les performances du système RAG sur de grands documents avec beaucoup de bruit. Texte générique ferroviaire de remplissage pour tester les performances du système RAG sur de grands documents avec beaucoup de bruit. Texte générique ferroviaire de remplissage pour tester les performances du système RAG sur de grands documents avec beaucoup de bruit. Texte générique ferroviaire de remplissage pour tester les performances du système RAG sur de grands documents avec beaucoup de bruit. Texte générique ferroviaire de remplissage pour tester les performances du système RAG sur de grands documents avec beaucoup de bruit. Texte générique ferroviaire de remplissage pour tester les performances du système RAG sur de grands documents avec beaucoup de bruit. Texte générique ferroviaire de remplissage pour tester les performances du système RAG sur de grands documents avec beaucoup de bruit. Texte générique ferroviaire de remplissage pour tester les performances du système RAG sur de grands documents avec beaucoup de bruit. Texte générique ferroviaire de remplissage pour tester les performances du système RAG sur de grands documents avec beaucoup de bruit. Texte générique ferroviaire de remplissage pour tester les performances du système RAG sur de grands documents avec beaucoup de bruit. Texte générique ferroviaire de remplissage pour tester les performances du système RAG sur de grands documents avec beaucoup de bruit. Texte générique ferroviaire de remplissage pour tester les performances du système RAG sur de grands documents avec beaucoup de bruit. Texte générique ferroviaire de remplissage pour tester les performances du système RAG sur de grands documents avec beaucoup de bruit. Texte générique ferroviaire de remplissage pour tester les performances du système RAG sur de grands documents avec beaucoup de bruit. Texte générique ferroviaire de remplissage pour tester les performances du système RAG sur de grands documents avec beaucoup de bruit. Texte générique ferroviaire de remplissage pour tester les performances du système RAG sur de grands documents avec beaucoup de bruit. Texte générique ferroviaire de remplissage pour tester les performances du système RAG sur de grands documents avec beaucoup de bruit. Texte générique ferroviaire de remplissage pour tester les performances du système RAG sur de grands documents avec beaucoup de bruit. Texte générique ferroviaire de remplissage pour tester les performances du système RAG sur de grands documents avec beaucoup de bruit. </w:t>
-      </w:r>
-    </w:p>
-    <w:p>
-      <w:r>
-        <w:br w:type="page"/>
-      </w:r>
-    </w:p>
-    <w:p>
-      <w:r>
-        <w:t>Page 4</w:t>
-        <w:br/>
-        <w:t xml:space="preserve">Texte générique ferroviaire de remplissage pour tester les performances du système RAG sur de grands documents avec beaucoup de bruit. Texte générique ferroviaire de remplissage pour tester les performances du système RAG sur de grands documents avec beaucoup de bruit. Texte générique ferroviaire de remplissage pour tester les performances du système RAG sur de grands documents avec beaucoup de bruit. Texte générique ferroviaire de remplissage pour tester les performances du système RAG sur de grands documents avec beaucoup de bruit. Texte générique ferroviaire de remplissage pour tester les performances du système RAG sur de grands documents avec beaucoup de bruit. Texte générique ferroviaire de remplissage pour tester les performances du système RAG sur de grands documents avec beaucoup de bruit. Texte générique ferroviaire de remplissage pour tester les performances du système RAG sur de grands documents avec beaucoup de bruit. Texte générique ferroviaire de remplissage pour tester les performances du système RAG sur de grands documents avec beaucoup de bruit. Texte générique ferroviaire de remplissage pour tester les performances du système RAG sur de grands documents avec beaucoup de bruit. Texte générique ferroviaire de remplissage pour tester les performances du système RAG sur de grands documents avec beaucoup de bruit. Texte générique ferroviaire de remplissage pour tester les performances du système RAG sur de grands documents avec beaucoup de bruit. Texte générique ferroviaire de remplissage pour tester les performances du système RAG sur de grands documents avec beaucoup de bruit. Texte générique ferroviaire de remplissage pour tester les performances du système RAG sur de grands documents avec beaucoup de bruit. Texte générique ferroviaire de remplissage pour tester les performances du système RAG sur de grands documents avec beaucoup de bruit. Texte générique ferroviaire de remplissage pour tester les performances du système RAG sur de grands documents avec beaucoup de bruit. Texte générique ferroviaire de remplissage pour tester les performances du système RAG sur de grands documents avec beaucoup de bruit. Texte générique ferroviaire de remplissage pour tester les performances du système RAG sur de grands documents avec beaucoup de bruit. Texte générique ferroviaire de remplissage pour tester les performances du système RAG sur de grands documents avec beaucoup de bruit. Texte générique ferroviaire de remplissage pour tester les performances du système RAG sur de grands documents avec beaucoup de bruit. Texte générique ferroviaire de remplissage pour tester les performances du système RAG sur de grands documents avec beaucoup de bruit. Texte générique ferroviaire de remplissage pour tester les performances du système RAG sur de grands documents avec beaucoup de bruit. Texte générique ferroviaire de remplissage pour tester les performances du système RAG sur de grands documents avec beaucoup de bruit. Texte générique ferroviaire de remplissage pour tester les performances du système RAG sur de grands documents avec beaucoup de bruit. Texte générique ferroviaire de remplissage pour tester les performances du système RAG sur de grands documents avec beaucoup de bruit. Texte générique ferroviaire de remplissage pour tester les performances du système RAG sur de grands documents avec beaucoup de bruit. Texte générique ferroviaire de remplissage pour tester les performances du système RAG sur de grands documents avec beaucoup de bruit. Texte générique ferroviaire de remplissage pour tester les performances du système RAG sur de grands documents avec beaucoup de bruit. Texte générique ferroviaire de remplissage pour tester les performances du système RAG sur de grands documents avec beaucoup de bruit. Texte générique ferroviaire de remplissage pour tester les performances du système RAG sur de grands documents avec beaucoup de bruit. Texte générique ferroviaire de remplissage pour tester les performances du système RAG sur de grands documents avec beaucoup de bruit. </w:t>
-      </w:r>
-    </w:p>
-    <w:p>
-      <w:r>
-        <w:br w:type="page"/>
-      </w:r>
-    </w:p>
-    <w:p>
-      <w:r>
-        <w:t>Page 5</w:t>
-        <w:br/>
-        <w:t xml:space="preserve">Texte générique ferroviaire de remplissage pour tester les performances du système RAG sur de grands documents avec beaucoup de bruit. Texte générique ferroviaire de remplissage pour tester les performances du système RAG sur de grands documents avec beaucoup de bruit. Texte générique ferroviaire de remplissage pour tester les performances du système RAG sur de grands documents avec beaucoup de bruit. Texte générique ferroviaire de remplissage pour tester les performances du système RAG sur de grands documents avec beaucoup de bruit. Texte générique ferroviaire de remplissage pour tester les performances du système RAG sur de grands documents avec beaucoup de bruit. Texte générique ferroviaire de remplissage pour tester les performances du système RAG sur de grands documents avec beaucoup de bruit. Texte générique ferroviaire de remplissage pour tester les performances du système RAG sur de grands documents avec beaucoup de bruit. Texte générique ferroviaire de remplissage pour tester les performances du système RAG sur de grands documents avec beaucoup de bruit. Texte générique ferroviaire de remplissage pour tester les performances du système RAG sur de grands documents avec beaucoup de bruit. Texte générique ferroviaire de remplissage pour tester les performances du système RAG sur de grands documents avec beaucoup de bruit. Texte générique ferroviaire de remplissage pour tester les performances du système RAG sur de grands documents avec beaucoup de bruit. Texte générique ferroviaire de remplissage pour tester les performances du système RAG sur de grands documents avec beaucoup de bruit. Texte générique ferroviaire de remplissage pour tester les performances du système RAG sur de grands documents avec beaucoup de bruit. Texte générique ferroviaire de remplissage pour tester les performances du système RAG sur de grands documents avec beaucoup de bruit. Texte générique ferroviaire de remplissage pour tester les performances du système RAG sur de grands documents avec beaucoup de bruit. Texte générique ferroviaire de remplissage pour tester les performances du système RAG sur de grands documents avec beaucoup de bruit. Texte générique ferroviaire de remplissage pour tester les performances du système RAG sur de grands documents avec beaucoup de bruit. Texte générique ferroviaire de remplissage pour tester les performances du système RAG sur de grands documents avec beaucoup de bruit. Texte générique ferroviaire de remplissage pour tester les performances du système RAG sur de grands documents avec beaucoup de bruit. Texte générique ferroviaire de remplissage pour tester les performances du système RAG sur de grands documents avec beaucoup de bruit. Texte générique ferroviaire de remplissage pour tester les performances du système RAG sur de grands documents avec beaucoup de bruit. Texte générique ferroviaire de remplissage pour tester les performances du système RAG sur de grands documents avec beaucoup de bruit. Texte générique ferroviaire de remplissage pour tester les performances du système RAG sur de grands documents avec beaucoup de bruit. Texte générique ferroviaire de remplissage pour tester les performances du système RAG sur de grands documents avec beaucoup de bruit. Texte générique ferroviaire de remplissage pour tester les performances du système RAG sur de grands documents avec beaucoup de bruit. Texte générique ferroviaire de remplissage pour tester les performances du système RAG sur de grands documents avec beaucoup de bruit. Texte générique ferroviaire de remplissage pour tester les performances du système RAG sur de grands documents avec beaucoup de bruit. Texte générique ferroviaire de remplissage pour tester les performances du système RAG sur de grands documents avec beaucoup de bruit. Texte générique ferroviaire de remplissage pour tester les performances du système RAG sur de grands documents avec beaucoup de bruit. Texte générique ferroviaire de remplissage pour tester les performances du système RAG sur de grands documents avec beaucoup de bruit. </w:t>
-      </w:r>
-    </w:p>
-    <w:p>
-      <w:r>
-        <w:br w:type="page"/>
-      </w:r>
-    </w:p>
-    <w:p>
-      <w:r>
-        <w:t>Page 6</w:t>
-        <w:br/>
-        <w:t xml:space="preserve">Texte générique ferroviaire de remplissage pour tester les performances du système RAG sur de grands documents avec beaucoup de bruit. Texte générique ferroviaire de remplissage pour tester les performances du système RAG sur de grands documents avec beaucoup de bruit. Texte générique ferroviaire de remplissage pour tester les performances du système RAG sur de grands documents avec beaucoup de bruit. Texte générique ferroviaire de remplissage pour tester les performances du système RAG sur de grands documents avec beaucoup de bruit. Texte générique ferroviaire de remplissage pour tester les performances du système RAG sur de grands documents avec beaucoup de bruit. Texte générique ferroviaire de remplissage pour tester les performances du système RAG sur de grands documents avec beaucoup de bruit. Texte générique ferroviaire de remplissage pour tester les performances du système RAG sur de grands documents avec beaucoup de bruit. Texte générique ferroviaire de remplissage pour tester les performances du système RAG sur de grands documents avec beaucoup de bruit. Texte générique ferroviaire de remplissage pour tester les performances du système RAG sur de grands documents avec beaucoup de bruit. Texte générique ferroviaire de remplissage pour tester les performances du système RAG sur de grands documents avec beaucoup de bruit. Texte générique ferroviaire de remplissage pour tester les performances du système RAG sur de grands documents avec beaucoup de bruit. Texte générique ferroviaire de remplissage pour tester les performances du système RAG sur de grands documents avec beaucoup de bruit. Texte générique ferroviaire de remplissage pour tester les performances du système RAG sur de grands documents avec beaucoup de bruit. Texte générique ferroviaire de remplissage pour tester les performances du système RAG sur de grands documents avec beaucoup de bruit. Texte générique ferroviaire de remplissage pour tester les performances du système RAG sur de grands documents avec beaucoup de bruit. Texte générique ferroviaire de remplissage pour tester les performances du système RAG sur de grands documents avec beaucoup de bruit. Texte générique ferroviaire de remplissage pour tester les performances du système RAG sur de grands documents avec beaucoup de bruit. Texte générique ferroviaire de remplissage pour tester les performances du système RAG sur de grands documents avec beaucoup de bruit. Texte générique ferroviaire de remplissage pour tester les performances du système RAG sur de grands documents avec beaucoup de bruit. Texte générique ferroviaire de remplissage pour tester les performances du système RAG sur de grands documents avec beaucoup de bruit. Texte générique ferroviaire de remplissage pour tester les performances du système RAG sur de grands documents avec beaucoup de bruit. Texte générique ferroviaire de remplissage pour tester les performances du système RAG sur de grands documents avec beaucoup de bruit. Texte générique ferroviaire de remplissage pour tester les performances du système RAG sur de grands documents avec beaucoup de bruit. Texte générique ferroviaire de remplissage pour tester les performances du système RAG sur de grands documents avec beaucoup de bruit. Texte générique ferroviaire de remplissage pour tester les performances du système RAG sur de grands documents avec beaucoup de bruit. Texte générique ferroviaire de remplissage pour tester les performances du système RAG sur de grands documents avec beaucoup de bruit. Texte générique ferroviaire de remplissage pour tester les performances du système RAG sur de grands documents avec beaucoup de bruit. Texte générique ferroviaire de remplissage pour tester les performances du système RAG sur de grands documents avec beaucoup de bruit. Texte générique ferroviaire de remplissage pour tester les performances du système RAG sur de grands documents avec beaucoup de bruit. Texte générique ferroviaire de remplissage pour tester les performances du système RAG sur de grands documents avec beaucoup de bruit. </w:t>
-      </w:r>
-    </w:p>
-    <w:p>
-      <w:r>
-        <w:br w:type="page"/>
-      </w:r>
-    </w:p>
-    <w:p>
-      <w:r>
-        <w:t>Page 7</w:t>
-        <w:br/>
-        <w:t xml:space="preserve">Texte générique ferroviaire de remplissage pour tester les performances du système RAG sur de grands documents avec beaucoup de bruit. Texte générique ferroviaire de remplissage pour tester les performances du système RAG sur de grands documents avec beaucoup de bruit. Texte générique ferroviaire de remplissage pour tester les performances du système RAG sur de grands documents avec beaucoup de bruit. Texte générique ferroviaire de remplissage pour tester les performances du système RAG sur de grands documents avec beaucoup de bruit. Texte générique ferroviaire de remplissage pour tester les performances du système RAG sur de grands documents avec beaucoup de bruit. Texte générique ferroviaire de remplissage pour tester les performances du système RAG sur de grands documents avec beaucoup de bruit. Texte générique ferroviaire de remplissage pour tester les performances du système RAG sur de grands documents avec beaucoup de bruit. Texte générique ferroviaire de remplissage pour tester les performances du système RAG sur de grands documents avec beaucoup de bruit. Texte générique ferroviaire de remplissage pour tester les performances du système RAG sur de grands documents avec beaucoup de bruit. Texte générique ferroviaire de remplissage pour tester les performances du système RAG sur de grands documents avec beaucoup de bruit. Texte générique ferroviaire de remplissage pour tester les performances du système RAG sur de grands documents avec beaucoup de bruit. Texte générique ferroviaire de remplissage pour tester les performances du système RAG sur de grands documents avec beaucoup de bruit. Texte générique ferroviaire de remplissage pour tester les performances du système RAG sur de grands documents avec beaucoup de bruit. Texte générique ferroviaire de remplissage pour tester les performances du système RAG sur de grands documents avec beaucoup de bruit. Texte générique ferroviaire de remplissage pour tester les performances du système RAG sur de grands documents avec beaucoup de bruit. Texte générique ferroviaire de remplissage pour tester les performances du système RAG sur de grands documents avec beaucoup de bruit. Texte générique ferroviaire de remplissage pour tester les performances du système RAG sur de grands documents avec beaucoup de bruit. Texte générique ferroviaire de remplissage pour tester les performances du système RAG sur de grands documents avec beaucoup de bruit. Texte générique ferroviaire de remplissage pour tester les performances du système RAG sur de grands documents avec beaucoup de bruit. Texte générique ferroviaire de remplissage pour tester les performances du système RAG sur de grands documents avec beaucoup de bruit. Texte générique ferroviaire de remplissage pour tester les performances du système RAG sur de grands documents avec beaucoup de bruit. Texte générique ferroviaire de remplissage pour tester les performances du système RAG sur de grands documents avec beaucoup de bruit. Texte générique ferroviaire de remplissage pour tester les performances du système RAG sur de grands documents avec beaucoup de bruit. Texte générique ferroviaire de remplissage pour tester les performances du système RAG sur de grands documents avec beaucoup de bruit. Texte générique ferroviaire de remplissage pour tester les performances du système RAG sur de grands documents avec beaucoup de bruit. Texte générique ferroviaire de remplissage pour tester les performances du système RAG sur de grands documents avec beaucoup de bruit. Texte générique ferroviaire de remplissage pour tester les performances du système RAG sur de grands documents avec beaucoup de bruit. Texte générique ferroviaire de remplissage pour tester les performances du système RAG sur de grands documents avec beaucoup de bruit. Texte générique ferroviaire de remplissage pour tester les performances du système RAG sur de grands documents avec beaucoup de bruit. Texte générique ferroviaire de remplissage pour tester les performances du système RAG sur de grands documents avec beaucoup de bruit. </w:t>
-      </w:r>
-    </w:p>
-    <w:p>
-      <w:r>
-        <w:br w:type="page"/>
-      </w:r>
-    </w:p>
-    <w:p>
-      <w:r>
-        <w:t>Les premières voies ferrées sont apparues au XIXe siècle, révolutionnant le transport de marchandises et de passagers.</w:t>
-      </w:r>
-    </w:p>
-    <w:p>
-      <w:r>
-        <w:br w:type="page"/>
-      </w:r>
-    </w:p>
-    <w:p>
-      <w:r>
-        <w:t>Page 9</w:t>
-        <w:br/>
-        <w:t xml:space="preserve">Texte générique ferroviaire de remplissage pour tester les performances du système RAG sur de grands documents avec beaucoup de bruit. Texte générique ferroviaire de remplissage pour tester les performances du système RAG sur de grands documents avec beaucoup de bruit. Texte générique ferroviaire de remplissage pour tester les performances du système RAG sur de grands documents avec beaucoup de bruit. Texte générique ferroviaire de remplissage pour tester les performances du système RAG sur de grands documents avec beaucoup de bruit. Texte générique ferroviaire de remplissage pour tester les performances du système RAG sur de grands documents avec beaucoup de bruit. Texte générique ferroviaire de remplissage pour tester les performances du système RAG sur de grands documents avec beaucoup de bruit. Texte générique ferroviaire de remplissage pour tester les performances du système RAG sur de grands documents avec beaucoup de bruit. Texte générique ferroviaire de remplissage pour tester les performances du système RAG sur de grands documents avec beaucoup de bruit. Texte générique ferroviaire de remplissage pour tester les performances du système RAG sur de grands documents avec beaucoup de bruit. Texte générique ferroviaire de remplissage pour tester les performances du système RAG sur de grands documents avec beaucoup de bruit. Texte générique ferroviaire de remplissage pour tester les performances du système RAG sur de grands documents avec beaucoup de bruit. Texte générique ferroviaire de remplissage pour tester les performances du système RAG sur de grands documents avec beaucoup de bruit. Texte générique ferroviaire de remplissage pour tester les performances du système RAG sur de grands documents avec beaucoup de bruit. Texte générique ferroviaire de remplissage pour tester les performances du système RAG sur de grands documents avec beaucoup de bruit. Texte générique ferroviaire de remplissage pour tester les performances du système RAG sur de grands documents avec beaucoup de bruit. Texte générique ferroviaire de remplissage pour tester les performances du système RAG sur de grands documents avec beaucoup de bruit. Texte générique ferroviaire de remplissage pour tester les performances du système RAG sur de grands documents avec beaucoup de bruit. Texte générique ferroviaire de remplissage pour tester les performances du système RAG sur de grands documents avec beaucoup de bruit. Texte générique ferroviaire de remplissage pour tester les performances du système RAG sur de grands documents avec beaucoup de bruit. Texte générique ferroviaire de remplissage pour tester les performances du système RAG sur de grands documents avec beaucoup de bruit. Texte générique ferroviaire de remplissage pour tester les performances du système RAG sur de grands documents avec beaucoup de bruit. Texte générique ferroviaire de remplissage pour tester les performances du système RAG sur de grands documents avec beaucoup de bruit. Texte générique ferroviaire de remplissage pour tester les performances du système RAG sur de grands documents avec beaucoup de bruit. Texte générique ferroviaire de remplissage pour tester les performances du système RAG sur de grands documents avec beaucoup de bruit. Texte générique ferroviaire de remplissage pour tester les performances du système RAG sur de grands documents avec beaucoup de bruit. Texte générique ferroviaire de remplissage pour tester les performances du système RAG sur de grands documents avec beaucoup de bruit. Texte générique ferroviaire de remplissage pour tester les performances du système RAG sur de grands documents avec beaucoup de bruit. Texte générique ferroviaire de remplissage pour tester les performances du système RAG sur de grands documents avec beaucoup de bruit. Texte générique ferroviaire de remplissage pour tester les performances du système RAG sur de grands documents avec beaucoup de bruit. Texte générique ferroviaire de remplissage pour tester les performances du système RAG sur de grands documents avec beaucoup de bruit. </w:t>
-      </w:r>
-    </w:p>
-    <w:p>
-      <w:r>
-        <w:br w:type="page"/>
-      </w:r>
-    </w:p>
-    <w:p>
-      <w:r>
-        <w:t>Page 10</w:t>
-        <w:br/>
-        <w:t xml:space="preserve">Texte générique ferroviaire de remplissage pour tester les performances du système RAG sur de grands documents avec beaucoup de bruit. Texte générique ferroviaire de remplissage pour tester les performances du système RAG sur de grands documents avec beaucoup de bruit. Texte générique ferroviaire de remplissage pour tester les performances du système RAG sur de grands documents avec beaucoup de bruit. Texte générique ferroviaire de remplissage pour tester les performances du système RAG sur de grands documents avec beaucoup de bruit. Texte générique ferroviaire de remplissage pour tester les performances du système RAG sur de grands documents avec beaucoup de bruit. Texte générique ferroviaire de remplissage pour tester les performances du système RAG sur de grands documents avec beaucoup de bruit. Texte générique ferroviaire de remplissage pour tester les performances du système RAG sur de grands documents avec beaucoup de bruit. Texte générique ferroviaire de remplissage pour tester les performances du système RAG sur de grands documents avec beaucoup de bruit. Texte générique ferroviaire de remplissage pour tester les performances du système RAG sur de grands documents avec beaucoup de bruit. Texte générique ferroviaire de remplissage pour tester les performances du système RAG sur de grands documents avec beaucoup de bruit. Texte générique ferroviaire de remplissage pour tester les performances du système RAG sur de grands documents avec beaucoup de bruit. Texte générique ferroviaire de remplissage pour tester les performances du système RAG sur de grands documents avec beaucoup de bruit. Texte générique ferroviaire de remplissage pour tester les performances du système RAG sur de grands documents avec beaucoup de bruit. Texte générique ferroviaire de remplissage pour tester les performances du système RAG sur de grands documents avec beaucoup de bruit. Texte générique ferroviaire de remplissage pour tester les performances du système RAG sur de grands documents avec beaucoup de bruit. Texte générique ferroviaire de remplissage pour tester les performances du système RAG sur de grands documents avec beaucoup de bruit. Texte générique ferroviaire de remplissage pour tester les performances du système RAG sur de grands documents avec beaucoup de bruit. Texte générique ferroviaire de remplissage pour tester les performances du système RAG sur de grands documents avec beaucoup de bruit. Texte générique ferroviaire de remplissage pour tester les performances du système RAG sur de grands documents avec beaucoup de bruit. Texte générique ferroviaire de remplissage pour tester les performances du système RAG sur de grands documents avec beaucoup de bruit. Texte générique ferroviaire de remplissage pour tester les performances du système RAG sur de grands documents avec beaucoup de bruit. Texte générique ferroviaire de remplissage pour tester les performances du système RAG sur de grands documents avec beaucoup de bruit. Texte générique ferroviaire de remplissage pour tester les performances du système RAG sur de grands documents avec beaucoup de bruit. Texte générique ferroviaire de remplissage pour tester les performances du système RAG sur de grands documents avec beaucoup de bruit. Texte générique ferroviaire de remplissage pour tester les performances du système RAG sur de grands documents avec beaucoup de bruit. Texte générique ferroviaire de remplissage pour tester les performances du système RAG sur de grands documents avec beaucoup de bruit. Texte générique ferroviaire de remplissage pour tester les performances du système RAG sur de grands documents avec beaucoup de bruit. Texte générique ferroviaire de remplissage pour tester les performances du système RAG sur de grands documents avec beaucoup de bruit. Texte générique ferroviaire de remplissage pour tester les performances du système RAG sur de grands documents avec beaucoup de bruit. Texte générique ferroviaire de remplissage pour tester les performances du système RAG sur de grands documents avec beaucoup de bruit. </w:t>
+        <w:rPr>
+          <w:sz w:val="22"/>
+        </w:rPr>
+        <w:t>Depuis le 1er avril 1999, l exploitation technique et commerciale du réseau est concédée à CAMRAIL. La compagnie assure le transport quotidien de voyageurs et de fret lourd sur plus de 1 000 km de voies métriques.</w:t>
       </w:r>
     </w:p>
     <w:sectPr>

</xml_diff>